<commit_message>
code du streamlit a ete modifier pour gere l'incoherence au niveau de mettre carre sur la maison v3
</commit_message>
<xml_diff>
--- a/Documentation_Projet_Immobilier.docx
+++ b/Documentation_Projet_Immobilier.docx
@@ -520,7 +520,397 @@
     </w:p>
     <w:p>
       <w:r>
-        <w:t>Import dans MySQL (base immobilier_dvf, table transactions) via LOAD DATA LOCAL INFILE. La partie ML repart de MySQL, plus du Parquet.</w:t>
+        <w:t>Import du dataset dans MySQL (base immobilier_dvf, table transactions) via transfert_bd.ipynb. La partie ML repart de MySQL, plus du Parquet.</w:t>
+      </w:r>
+    </w:p>
+    <w:p>
+      <w:r>
+        <w:t>Comment on charge les 5,6 M lignes — 4 étapes :</w:t>
+      </w:r>
+    </w:p>
+    <w:tbl>
+      <w:tblPr>
+        <w:tblStyle w:val="LightGrid-Accent1"/>
+        <w:tblW w:type="auto" w:w="0"/>
+        <w:tblLook w:firstColumn="1" w:firstRow="1" w:lastColumn="0" w:lastRow="0" w:noHBand="0" w:noVBand="1" w:val="04A0"/>
+      </w:tblPr>
+      <w:tblGrid>
+        <w:gridCol w:w="2880"/>
+        <w:gridCol w:w="2880"/>
+        <w:gridCol w:w="2880"/>
+      </w:tblGrid>
+      <w:tr>
+        <w:tc>
+          <w:tcPr>
+            <w:tcW w:type="dxa" w:w="2880"/>
+          </w:tcPr>
+          <w:p>
+            <w:r/>
+            <w:r>
+              <w:rPr>
+                <w:b/>
+                <w:sz w:val="20"/>
+              </w:rPr>
+              <w:t>Étape</w:t>
+            </w:r>
+          </w:p>
+        </w:tc>
+        <w:tc>
+          <w:tcPr>
+            <w:tcW w:type="dxa" w:w="2880"/>
+          </w:tcPr>
+          <w:p>
+            <w:r/>
+            <w:r>
+              <w:rPr>
+                <w:b/>
+                <w:sz w:val="20"/>
+              </w:rPr>
+              <w:t>Action</w:t>
+            </w:r>
+          </w:p>
+        </w:tc>
+        <w:tc>
+          <w:tcPr>
+            <w:tcW w:type="dxa" w:w="2880"/>
+          </w:tcPr>
+          <w:p>
+            <w:r/>
+            <w:r>
+              <w:rPr>
+                <w:b/>
+                <w:sz w:val="20"/>
+              </w:rPr>
+              <w:t>Pourquoi</w:t>
+            </w:r>
+          </w:p>
+        </w:tc>
+      </w:tr>
+      <w:tr>
+        <w:tc>
+          <w:tcPr>
+            <w:tcW w:type="dxa" w:w="2880"/>
+          </w:tcPr>
+          <w:p>
+            <w:r/>
+            <w:r>
+              <w:rPr>
+                <w:sz w:val="20"/>
+              </w:rPr>
+              <w:t>1</w:t>
+            </w:r>
+          </w:p>
+        </w:tc>
+        <w:tc>
+          <w:tcPr>
+            <w:tcW w:type="dxa" w:w="2880"/>
+          </w:tcPr>
+          <w:p>
+            <w:r/>
+            <w:r>
+              <w:rPr>
+                <w:sz w:val="20"/>
+              </w:rPr>
+              <w:t>pd.read_parquet(...)</w:t>
+            </w:r>
+          </w:p>
+        </w:tc>
+        <w:tc>
+          <w:tcPr>
+            <w:tcW w:type="dxa" w:w="2880"/>
+          </w:tcPr>
+          <w:p>
+            <w:r/>
+            <w:r>
+              <w:rPr>
+                <w:sz w:val="20"/>
+              </w:rPr>
+              <w:t>on charge le dataset final propre</w:t>
+            </w:r>
+          </w:p>
+        </w:tc>
+      </w:tr>
+      <w:tr>
+        <w:tc>
+          <w:tcPr>
+            <w:tcW w:type="dxa" w:w="2880"/>
+          </w:tcPr>
+          <w:p>
+            <w:r/>
+            <w:r>
+              <w:rPr>
+                <w:sz w:val="20"/>
+              </w:rPr>
+              <w:t>2</w:t>
+            </w:r>
+          </w:p>
+        </w:tc>
+        <w:tc>
+          <w:tcPr>
+            <w:tcW w:type="dxa" w:w="2880"/>
+          </w:tcPr>
+          <w:p>
+            <w:r/>
+            <w:r>
+              <w:rPr>
+                <w:sz w:val="20"/>
+              </w:rPr>
+              <w:t>df.to_csv(..., sep=';')</w:t>
+            </w:r>
+          </w:p>
+        </w:tc>
+        <w:tc>
+          <w:tcPr>
+            <w:tcW w:type="dxa" w:w="2880"/>
+          </w:tcPr>
+          <w:p>
+            <w:r/>
+            <w:r>
+              <w:rPr>
+                <w:sz w:val="20"/>
+              </w:rPr>
+              <w:t>MySQL ne lit pas le Parquet ; son chargeur rapide lit du texte/CSV</w:t>
+            </w:r>
+          </w:p>
+        </w:tc>
+      </w:tr>
+      <w:tr>
+        <w:tc>
+          <w:tcPr>
+            <w:tcW w:type="dxa" w:w="2880"/>
+          </w:tcPr>
+          <w:p>
+            <w:r/>
+            <w:r>
+              <w:rPr>
+                <w:sz w:val="20"/>
+              </w:rPr>
+              <w:t>3</w:t>
+            </w:r>
+          </w:p>
+        </w:tc>
+        <w:tc>
+          <w:tcPr>
+            <w:tcW w:type="dxa" w:w="2880"/>
+          </w:tcPr>
+          <w:p>
+            <w:r/>
+            <w:r>
+              <w:rPr>
+                <w:sz w:val="20"/>
+              </w:rPr>
+              <w:t>df.head(0).to_sql(...)</w:t>
+            </w:r>
+          </w:p>
+        </w:tc>
+        <w:tc>
+          <w:tcPr>
+            <w:tcW w:type="dxa" w:w="2880"/>
+          </w:tcPr>
+          <w:p>
+            <w:r/>
+            <w:r>
+              <w:rPr>
+                <w:sz w:val="20"/>
+              </w:rPr>
+              <w:t>crée la structure vide de la table (schéma déduit par pandas)</w:t>
+            </w:r>
+          </w:p>
+        </w:tc>
+      </w:tr>
+      <w:tr>
+        <w:tc>
+          <w:tcPr>
+            <w:tcW w:type="dxa" w:w="2880"/>
+          </w:tcPr>
+          <w:p>
+            <w:r/>
+            <w:r>
+              <w:rPr>
+                <w:sz w:val="20"/>
+              </w:rPr>
+              <w:t>4</w:t>
+            </w:r>
+          </w:p>
+        </w:tc>
+        <w:tc>
+          <w:tcPr>
+            <w:tcW w:type="dxa" w:w="2880"/>
+          </w:tcPr>
+          <w:p>
+            <w:r/>
+            <w:r>
+              <w:rPr>
+                <w:sz w:val="20"/>
+              </w:rPr>
+              <w:t>LOAD DATA LOCAL INFILE</w:t>
+            </w:r>
+          </w:p>
+        </w:tc>
+        <w:tc>
+          <w:tcPr>
+            <w:tcW w:type="dxa" w:w="2880"/>
+          </w:tcPr>
+          <w:p>
+            <w:r/>
+            <w:r>
+              <w:rPr>
+                <w:sz w:val="20"/>
+              </w:rPr>
+              <w:t>insère les 5,6 M lignes en une seule opération (quelques secondes)</w:t>
+            </w:r>
+          </w:p>
+        </w:tc>
+      </w:tr>
+    </w:tbl>
+    <w:p/>
+    <w:p>
+      <w:r>
+        <w:t>Pourquoi LOAD DATA et pas df.to_sql() pour tout ? to_sql insère par petits paquets via des milliers de requêtes INSERT, beaucoup trop lent sur 5,6 M lignes. LOAD DATA LOCAL INFILE est le chargeur natif de MySQL (lecture du CSV côté serveur, en masse). On utilise donc to_sql uniquement pour créer la table vide, et LOAD DATA pour les données.</w:t>
+      </w:r>
+    </w:p>
+    <w:p>
+      <w:r>
+        <w:t>Pourquoi passer par MySQL plutôt que lire directement le Parquet ?</w:t>
+      </w:r>
+    </w:p>
+    <w:tbl>
+      <w:tblPr>
+        <w:tblStyle w:val="LightGrid-Accent1"/>
+        <w:tblW w:type="auto" w:w="0"/>
+        <w:tblLook w:firstColumn="1" w:firstRow="1" w:lastColumn="0" w:lastRow="0" w:noHBand="0" w:noVBand="1" w:val="04A0"/>
+      </w:tblPr>
+      <w:tblGrid>
+        <w:gridCol w:w="4320"/>
+        <w:gridCol w:w="4320"/>
+      </w:tblGrid>
+      <w:tr>
+        <w:tc>
+          <w:tcPr>
+            <w:tcW w:type="dxa" w:w="4320"/>
+          </w:tcPr>
+          <w:p>
+            <w:r/>
+            <w:r>
+              <w:rPr>
+                <w:b/>
+                <w:sz w:val="20"/>
+              </w:rPr>
+              <w:t>Parquet (fichier)</w:t>
+            </w:r>
+          </w:p>
+        </w:tc>
+        <w:tc>
+          <w:tcPr>
+            <w:tcW w:type="dxa" w:w="4320"/>
+          </w:tcPr>
+          <w:p>
+            <w:r/>
+            <w:r>
+              <w:rPr>
+                <w:b/>
+                <w:sz w:val="20"/>
+              </w:rPr>
+              <w:t>MySQL (Data Warehouse)</w:t>
+            </w:r>
+          </w:p>
+        </w:tc>
+      </w:tr>
+      <w:tr>
+        <w:tc>
+          <w:tcPr>
+            <w:tcW w:type="dxa" w:w="4320"/>
+          </w:tcPr>
+          <w:p>
+            <w:r/>
+            <w:r>
+              <w:rPr>
+                <w:sz w:val="20"/>
+              </w:rPr>
+              <w:t>Fichier sur disque, mono-utilisateur</w:t>
+            </w:r>
+          </w:p>
+        </w:tc>
+        <w:tc>
+          <w:tcPr>
+            <w:tcW w:type="dxa" w:w="4320"/>
+          </w:tcPr>
+          <w:p>
+            <w:r/>
+            <w:r>
+              <w:rPr>
+                <w:sz w:val="20"/>
+              </w:rPr>
+              <w:t>Service interrogeable, multi-utilisateur</w:t>
+            </w:r>
+          </w:p>
+        </w:tc>
+      </w:tr>
+      <w:tr>
+        <w:tc>
+          <w:tcPr>
+            <w:tcW w:type="dxa" w:w="4320"/>
+          </w:tcPr>
+          <w:p>
+            <w:r/>
+            <w:r>
+              <w:rPr>
+                <w:sz w:val="20"/>
+              </w:rPr>
+              <w:t>On charge tout en mémoire</w:t>
+            </w:r>
+          </w:p>
+        </w:tc>
+        <w:tc>
+          <w:tcPr>
+            <w:tcW w:type="dxa" w:w="4320"/>
+          </w:tcPr>
+          <w:p>
+            <w:r/>
+            <w:r>
+              <w:rPr>
+                <w:sz w:val="20"/>
+              </w:rPr>
+              <w:t>SQL : WHERE, LIMIT, RAND(), GROUP BY… côté serveur</w:t>
+            </w:r>
+          </w:p>
+        </w:tc>
+      </w:tr>
+      <w:tr>
+        <w:tc>
+          <w:tcPr>
+            <w:tcW w:type="dxa" w:w="4320"/>
+          </w:tcPr>
+          <w:p>
+            <w:r/>
+            <w:r>
+              <w:rPr>
+                <w:sz w:val="20"/>
+              </w:rPr>
+              <w:t>Pas de requêtes</w:t>
+            </w:r>
+          </w:p>
+        </w:tc>
+        <w:tc>
+          <w:tcPr>
+            <w:tcW w:type="dxa" w:w="4320"/>
+          </w:tcPr>
+          <w:p>
+            <w:r/>
+            <w:r>
+              <w:rPr>
+                <w:sz w:val="20"/>
+              </w:rPr>
+              <w:t>Filtrage / échantillonnage sans tout charger</w:t>
+            </w:r>
+          </w:p>
+        </w:tc>
+      </w:tr>
+    </w:tbl>
+    <w:p/>
+    <w:p>
+      <w:r>
+        <w:t>Concrètement, l'EDA échantillonne directement en base (SELECT ... WHERE RAND() &lt; 0.04 LIMIT 200000) sans charger les 5,6 M lignes. Le Parquet est le résultat de l'ETL ; MySQL est le Data Warehouse qui expose ces données de façon interrogeable, pour simuler un environnement de production.</w:t>
       </w:r>
     </w:p>
     <w:p>

</xml_diff>